<commit_message>
TIM submission package: real-waveform validation, OMML equations, inline figs/tables, reproducible pipeline
Co-Authored-By: Tatsuki Onishi <bougtoir@gmail.com>
</commit_message>
<xml_diff>
--- a/zero_calibration_bpm/manuscripts/BPM_ZeroFree_Manuscript_JA.docx
+++ b/zero_calibration_bpm/manuscripts/BPM_ZeroFree_Manuscript_JA.docx
@@ -296,7 +296,26 @@
           <w:sz w:val="22"/>
           <w:vertAlign w:val="superscript"/>
         </w:rPr>
-        <w:t>1–2</w:t>
+        <w:t>1</w:t>
+      </w:r>
+      <w:r>
+        <w:rPr>
+          <w:rFonts w:ascii="MS Mincho" w:hAnsi="MS Mincho" w:eastAsia="MS Mincho"/>
+          <w:b w:val="0"/>
+          <w:i w:val="0"/>
+          <w:sz w:val="22"/>
+        </w:rPr>
+        <w:t xml:space="preserve">, </w:t>
+      </w:r>
+      <w:r>
+        <w:rPr>
+          <w:rFonts w:ascii="MS Mincho" w:hAnsi="MS Mincho" w:eastAsia="MS Mincho"/>
+          <w:b w:val="0"/>
+          <w:i w:val="0"/>
+          <w:sz w:val="22"/>
+          <w:vertAlign w:val="superscript"/>
+        </w:rPr>
+        <w:t>2</w:t>
       </w:r>
       <w:r>
         <w:rPr>
@@ -348,7 +367,26 @@
           <w:sz w:val="22"/>
           <w:vertAlign w:val="superscript"/>
         </w:rPr>
-        <w:t>4–5</w:t>
+        <w:t>4</w:t>
+      </w:r>
+      <w:r>
+        <w:rPr>
+          <w:rFonts w:ascii="MS Mincho" w:hAnsi="MS Mincho" w:eastAsia="MS Mincho"/>
+          <w:b w:val="0"/>
+          <w:i w:val="0"/>
+          <w:sz w:val="22"/>
+        </w:rPr>
+        <w:t xml:space="preserve">, </w:t>
+      </w:r>
+      <w:r>
+        <w:rPr>
+          <w:rFonts w:ascii="MS Mincho" w:hAnsi="MS Mincho" w:eastAsia="MS Mincho"/>
+          <w:b w:val="0"/>
+          <w:i w:val="0"/>
+          <w:sz w:val="22"/>
+          <w:vertAlign w:val="superscript"/>
+        </w:rPr>
+        <w:t>5</w:t>
       </w:r>
       <w:r>
         <w:rPr>
@@ -433,7 +471,26 @@
           <w:sz w:val="22"/>
           <w:vertAlign w:val="superscript"/>
         </w:rPr>
-        <w:t>4–5</w:t>
+        <w:t>4</w:t>
+      </w:r>
+      <w:r>
+        <w:rPr>
+          <w:rFonts w:ascii="MS Mincho" w:hAnsi="MS Mincho" w:eastAsia="MS Mincho"/>
+          <w:b w:val="0"/>
+          <w:i w:val="0"/>
+          <w:sz w:val="22"/>
+        </w:rPr>
+        <w:t xml:space="preserve">, </w:t>
+      </w:r>
+      <w:r>
+        <w:rPr>
+          <w:rFonts w:ascii="MS Mincho" w:hAnsi="MS Mincho" w:eastAsia="MS Mincho"/>
+          <w:b w:val="0"/>
+          <w:i w:val="0"/>
+          <w:sz w:val="22"/>
+          <w:vertAlign w:val="superscript"/>
+        </w:rPr>
+        <w:t>5</w:t>
       </w:r>
       <w:r>
         <w:rPr>
@@ -556,7 +613,26 @@
           <w:sz w:val="22"/>
           <w:vertAlign w:val="superscript"/>
         </w:rPr>
-        <w:t>11–12</w:t>
+        <w:t>11</w:t>
+      </w:r>
+      <w:r>
+        <w:rPr>
+          <w:rFonts w:ascii="MS Mincho" w:hAnsi="MS Mincho" w:eastAsia="MS Mincho"/>
+          <w:b w:val="0"/>
+          <w:i w:val="0"/>
+          <w:sz w:val="22"/>
+        </w:rPr>
+        <w:t xml:space="preserve">, </w:t>
+      </w:r>
+      <w:r>
+        <w:rPr>
+          <w:rFonts w:ascii="MS Mincho" w:hAnsi="MS Mincho" w:eastAsia="MS Mincho"/>
+          <w:b w:val="0"/>
+          <w:i w:val="0"/>
+          <w:sz w:val="22"/>
+          <w:vertAlign w:val="superscript"/>
+        </w:rPr>
+        <w:t>12</w:t>
       </w:r>
       <w:r>
         <w:rPr>
@@ -613,7 +689,26 @@
           <w:sz w:val="22"/>
           <w:vertAlign w:val="superscript"/>
         </w:rPr>
-        <w:t>15–16</w:t>
+        <w:t>15</w:t>
+      </w:r>
+      <w:r>
+        <w:rPr>
+          <w:rFonts w:ascii="MS Mincho" w:hAnsi="MS Mincho" w:eastAsia="MS Mincho"/>
+          <w:b w:val="0"/>
+          <w:i w:val="0"/>
+          <w:sz w:val="22"/>
+        </w:rPr>
+        <w:t xml:space="preserve">, </w:t>
+      </w:r>
+      <w:r>
+        <w:rPr>
+          <w:rFonts w:ascii="MS Mincho" w:hAnsi="MS Mincho" w:eastAsia="MS Mincho"/>
+          <w:b w:val="0"/>
+          <w:i w:val="0"/>
+          <w:sz w:val="22"/>
+          <w:vertAlign w:val="superscript"/>
+        </w:rPr>
+        <w:t>16</w:t>
       </w:r>
       <w:r>
         <w:rPr>
@@ -996,7 +1091,26 @@
           <w:sz w:val="22"/>
           <w:vertAlign w:val="superscript"/>
         </w:rPr>
-        <w:t>18–19</w:t>
+        <w:t>18</w:t>
+      </w:r>
+      <w:r>
+        <w:rPr>
+          <w:rFonts w:ascii="MS Mincho" w:hAnsi="MS Mincho" w:eastAsia="MS Mincho"/>
+          <w:b w:val="0"/>
+          <w:i w:val="0"/>
+          <w:sz w:val="22"/>
+        </w:rPr>
+        <w:t xml:space="preserve">, </w:t>
+      </w:r>
+      <w:r>
+        <w:rPr>
+          <w:rFonts w:ascii="MS Mincho" w:hAnsi="MS Mincho" w:eastAsia="MS Mincho"/>
+          <w:b w:val="0"/>
+          <w:i w:val="0"/>
+          <w:sz w:val="22"/>
+          <w:vertAlign w:val="superscript"/>
+        </w:rPr>
+        <w:t>19</w:t>
       </w:r>
       <w:r>
         <w:rPr>
@@ -1578,7 +1692,26 @@
           <w:sz w:val="22"/>
           <w:vertAlign w:val="superscript"/>
         </w:rPr>
-        <w:t>20–21</w:t>
+        <w:t>20</w:t>
+      </w:r>
+      <w:r>
+        <w:rPr>
+          <w:rFonts w:ascii="MS Mincho" w:hAnsi="MS Mincho" w:eastAsia="MS Mincho"/>
+          <w:b w:val="0"/>
+          <w:i w:val="0"/>
+          <w:sz w:val="22"/>
+        </w:rPr>
+        <w:t xml:space="preserve">, </w:t>
+      </w:r>
+      <w:r>
+        <w:rPr>
+          <w:rFonts w:ascii="MS Mincho" w:hAnsi="MS Mincho" w:eastAsia="MS Mincho"/>
+          <w:b w:val="0"/>
+          <w:i w:val="0"/>
+          <w:sz w:val="22"/>
+          <w:vertAlign w:val="superscript"/>
+        </w:rPr>
+        <w:t>21</w:t>
       </w:r>
       <w:r>
         <w:rPr>
@@ -1597,7 +1730,26 @@
           <w:sz w:val="22"/>
           <w:vertAlign w:val="superscript"/>
         </w:rPr>
-        <w:t>15–16</w:t>
+        <w:t>15</w:t>
+      </w:r>
+      <w:r>
+        <w:rPr>
+          <w:rFonts w:ascii="MS Mincho" w:hAnsi="MS Mincho" w:eastAsia="MS Mincho"/>
+          <w:b w:val="0"/>
+          <w:i w:val="0"/>
+          <w:sz w:val="22"/>
+        </w:rPr>
+        <w:t xml:space="preserve">, </w:t>
+      </w:r>
+      <w:r>
+        <w:rPr>
+          <w:rFonts w:ascii="MS Mincho" w:hAnsi="MS Mincho" w:eastAsia="MS Mincho"/>
+          <w:b w:val="0"/>
+          <w:i w:val="0"/>
+          <w:sz w:val="22"/>
+          <w:vertAlign w:val="superscript"/>
+        </w:rPr>
+        <w:t>16</w:t>
       </w:r>
       <w:r>
         <w:rPr>
@@ -1664,7 +1816,26 @@
           <w:sz w:val="22"/>
           <w:vertAlign w:val="superscript"/>
         </w:rPr>
-        <w:t>6,19</w:t>
+        <w:t>6</w:t>
+      </w:r>
+      <w:r>
+        <w:rPr>
+          <w:rFonts w:ascii="MS Mincho" w:hAnsi="MS Mincho" w:eastAsia="MS Mincho"/>
+          <w:b w:val="0"/>
+          <w:i w:val="0"/>
+          <w:sz w:val="22"/>
+        </w:rPr>
+        <w:t xml:space="preserve">, </w:t>
+      </w:r>
+      <w:r>
+        <w:rPr>
+          <w:rFonts w:ascii="MS Mincho" w:hAnsi="MS Mincho" w:eastAsia="MS Mincho"/>
+          <w:b w:val="0"/>
+          <w:i w:val="0"/>
+          <w:sz w:val="22"/>
+          <w:vertAlign w:val="superscript"/>
+        </w:rPr>
+        <w:t>19</w:t>
       </w:r>
       <w:r>
         <w:rPr>
@@ -1745,7 +1916,26 @@
           <w:sz w:val="22"/>
           <w:vertAlign w:val="superscript"/>
         </w:rPr>
-        <w:t>23–24</w:t>
+        <w:t>23</w:t>
+      </w:r>
+      <w:r>
+        <w:rPr>
+          <w:rFonts w:ascii="MS Mincho" w:hAnsi="MS Mincho" w:eastAsia="MS Mincho"/>
+          <w:b w:val="0"/>
+          <w:i w:val="0"/>
+          <w:sz w:val="22"/>
+        </w:rPr>
+        <w:t xml:space="preserve">, </w:t>
+      </w:r>
+      <w:r>
+        <w:rPr>
+          <w:rFonts w:ascii="MS Mincho" w:hAnsi="MS Mincho" w:eastAsia="MS Mincho"/>
+          <w:b w:val="0"/>
+          <w:i w:val="0"/>
+          <w:sz w:val="22"/>
+          <w:vertAlign w:val="superscript"/>
+        </w:rPr>
+        <w:t>24</w:t>
       </w:r>
       <w:r>
         <w:rPr>
@@ -1869,7 +2059,64 @@
           <w:sz w:val="22"/>
           <w:vertAlign w:val="superscript"/>
         </w:rPr>
-        <w:t>28–31</w:t>
+        <w:t>28</w:t>
+      </w:r>
+      <w:r>
+        <w:rPr>
+          <w:rFonts w:ascii="MS Mincho" w:hAnsi="MS Mincho" w:eastAsia="MS Mincho"/>
+          <w:b w:val="0"/>
+          <w:i w:val="0"/>
+          <w:sz w:val="22"/>
+        </w:rPr>
+        <w:t xml:space="preserve">, </w:t>
+      </w:r>
+      <w:r>
+        <w:rPr>
+          <w:rFonts w:ascii="MS Mincho" w:hAnsi="MS Mincho" w:eastAsia="MS Mincho"/>
+          <w:b w:val="0"/>
+          <w:i w:val="0"/>
+          <w:sz w:val="22"/>
+          <w:vertAlign w:val="superscript"/>
+        </w:rPr>
+        <w:t>29</w:t>
+      </w:r>
+      <w:r>
+        <w:rPr>
+          <w:rFonts w:ascii="MS Mincho" w:hAnsi="MS Mincho" w:eastAsia="MS Mincho"/>
+          <w:b w:val="0"/>
+          <w:i w:val="0"/>
+          <w:sz w:val="22"/>
+        </w:rPr>
+        <w:t xml:space="preserve">, </w:t>
+      </w:r>
+      <w:r>
+        <w:rPr>
+          <w:rFonts w:ascii="MS Mincho" w:hAnsi="MS Mincho" w:eastAsia="MS Mincho"/>
+          <w:b w:val="0"/>
+          <w:i w:val="0"/>
+          <w:sz w:val="22"/>
+          <w:vertAlign w:val="superscript"/>
+        </w:rPr>
+        <w:t>30</w:t>
+      </w:r>
+      <w:r>
+        <w:rPr>
+          <w:rFonts w:ascii="MS Mincho" w:hAnsi="MS Mincho" w:eastAsia="MS Mincho"/>
+          <w:b w:val="0"/>
+          <w:i w:val="0"/>
+          <w:sz w:val="22"/>
+        </w:rPr>
+        <w:t xml:space="preserve">, </w:t>
+      </w:r>
+      <w:r>
+        <w:rPr>
+          <w:rFonts w:ascii="MS Mincho" w:hAnsi="MS Mincho" w:eastAsia="MS Mincho"/>
+          <w:b w:val="0"/>
+          <w:i w:val="0"/>
+          <w:sz w:val="22"/>
+          <w:vertAlign w:val="superscript"/>
+        </w:rPr>
+        <w:t>31</w:t>
       </w:r>
       <w:r>
         <w:rPr>

</xml_diff>